<commit_message>
fix(docx): align 4D pagination and strengthen parity proofs
</commit_message>
<xml_diff>
--- a/_SAMPLES_ENTREGAVEIS/four_d_report/sample-four-d-report-v1.0.0.docx
+++ b/_SAMPLES_ENTREGAVEIS/four_d_report/sample-four-d-report-v1.0.0.docx
@@ -1633,6 +1633,11 @@
       </w:r>
     </w:p>
     <w:p>
+      <w:r>
+        <w:br w:type="page"/>
+      </w:r>
+    </w:p>
+    <w:p>
       <w:pPr>
         <w:pStyle w:val="Heading1"/>
         <w:spacing w:before="200" w:after="140" w:line="264" w:lineRule="exact"/>

</xml_diff>